<commit_message>
Version 21.0 → 22.0: Vollständige Validierung + Ergebnisprotokoll
Validierung-Ergebnisse.md: Neuer Block gemäß Validierung.md
- 19 Prüfschritte dokumentiert (17× ✅, 1× ⚠️ URL-Stichprobe, 1× ✅ mit 9 informativen Warnungen)
- 7 Fehler gefunden und behoben (Querverweise, Formatierung, validate.py)
- Nachprüfung: validate.py + red_thread.py bestanden
- Exports: Wiki, GitHub Wiki, PDF, DOCX erstellt

Version: 21.0 → 22.0 (Header, Footer, Validierung-Ergebnisse.md, docs/index.md)

https://claude.ai/code/session_01PFeLNnCR3FrQPcaZf8Mc5W
</commit_message>
<xml_diff>
--- a/Wolkenfrei.docx
+++ b/Wolkenfrei.docx
@@ -109,7 +109,7 @@
         <w:t xml:space="preserve"> </w:t>
       </w:r>
       <w:r>
-        <w:t xml:space="preserve">21.0 — April 2026 · 210 Quellen · 19 Kapitel</w:t>
+        <w:t xml:space="preserve">22.0 — April 2026 · 210 Quellen · 19 Kapitel</w:t>
       </w:r>
       <w:r>
         <w:br/>
@@ -41909,7 +41909,7 @@
           <w:iCs/>
           <w:i/>
         </w:rPr>
-        <w:t xml:space="preserve">Dieses Dokument basiert ausschließlich auf öffentlich zugänglichen Quellen, wurde mit Claude (Anthropic) erstellt. Version 21.0, April 2026. 210 Quellen. 19 Kapitel. Es stellt keine Rechtsberatung dar.</w:t>
+        <w:t xml:space="preserve">Dieses Dokument basiert ausschließlich auf öffentlich zugänglichen Quellen, wurde mit Claude (Anthropic) erstellt. Version 22.0, April 2026. 210 Quellen. 19 Kapitel. Es stellt keine Rechtsberatung dar.</w:t>
       </w:r>
     </w:p>
     <w:bookmarkEnd w:id="182"/>

</xml_diff>

<commit_message>
§1.2.1 gekürzt: ein Absatz, keine Redundanzen zu §7/§12/§17
https://claude.ai/code/session_01PFeLNnCR3FrQPcaZf8Mc5W
</commit_message>
<xml_diff>
--- a/Wolkenfrei.docx
+++ b/Wolkenfrei.docx
@@ -1218,15 +1218,7 @@
         <w:pStyle w:val="FirstParagraph"/>
       </w:pPr>
       <w:r>
-        <w:t xml:space="preserve">Die KVNO baut ihre KI-Plattform auf Azure (TED 98706-2026). Kubus IT migriert GKV-Infrastruktur über Arvato zu Google Cloud. Kliniken evaluieren Oracle Cerner auf OCI. Die Sogwirkung ist real: AWS und Azure bieten je über 200 verwaltete Dienste (Managed Databases, Serverless, IoT/Edge, DevOps-Toolchains, Data Warehouse, globale CDN) — EU-Anbieter wie STACKIT bieten 40–60 Kernservices. Für eine GKV, die erstmals eine Cloud-basierte KI-Plattform oder ein Analytics-System aufbauen will, ist Azure der Weg des geringsten Widerstands: ein Anbieter, ein Vertrag, ein Ökosystem mit E-Mail, Identity, Collaboration, Datenbanken, KI-Services und Entwicklertools in einer integrierten Umgebung. § 393 SGB V mit C5-Testat gibt die formale Erlaubnis, und die Vertriebsteams der Hyperscaler liefern Proof-of-Concept-Infrastruktur, KHZG-Beratung und Förderbudgets gleich mit (§1.2.5).</w:t>
-      </w:r>
-    </w:p>
-    <w:p>
-      <w:pPr>
-        <w:pStyle w:val="BodyText"/>
-      </w:pPr>
-      <w:r>
-        <w:t xml:space="preserve">Das Problem entsteht nicht beim Einstieg — es entsteht danach. Jeder Azure-Managed-Service, jedes proprietäre API, jeder Microsoft-365-Workflow, der mit Patientendaten arbeitet, vertieft die Abhängigkeit. Nach 12–24 Monaten ist die Organisation in 15–20 integrierte Schichten eingebettet — E-Mail, Identity, Collaboration, Datenbanken, KI. Wer dann aufgrund eines Schrems-III-Urteils, einer Aufsichtsverfügung oder einer geopolitischen Eskalation wechseln muss, steht vor einem Mehrjahresprojekt. Die Drei-Zonen-Migrationsstrategie in §17.3 adressiert genau dieses Szenario — aber sie funktioniert nur, wenn die Exit-Option von Anfang an mitgeplant wird, nicht erst wenn der Druck da ist. Details zur Service-Tiefe in Kapitel 7, zur Exit-Strategie in §17.6.</w:t>
+        <w:t xml:space="preserve">Azure und AWS bieten je über 200 verwaltete Dienste — EU-Anbieter wie STACKIT 40–60. Für eine GKV oder Klinik, die erstmals eine Cloud-basierte KI-Plattform, ein Analytics-System oder eine moderne Collaboration-Umgebung aufbaut, ist ein US-Hyperscaler schlicht der Weg des geringsten Widerstands: ein Anbieter, ein Vertrag, ein integriertes Ökosystem. Die CLOUD-Act-Frage stellt sich im Beschaffungsprozess nicht, weil § 393 SGB V mit C5-Testat die formale Erlaubnis gibt und die Jurisdiktionsprüfung kein Vergabekriterium ist. Details in Kapitel 7 und 8.</w:t>
       </w:r>
     </w:p>
     <w:bookmarkEnd w:id="23"/>

</xml_diff>